<commit_message>
Complete AMA author lists and state where the 2025 series' figures come from
Checked the "et al." references against PubMed and publisher records. AMA lists
every author up to six, so [4], [15] and [16] (five authors each) and [10] and
[19] (six each) are now given in full; the others have more than six and keep
three plus et al. Every checked title, journal, year, volume and page range
matched.

The 2025 multicenter series [13] reports 93% on the original clinical reports
and 97% on blinded review, after excluding non-diagnostic and equivocal
examinations; the Discussion now says so instead of quoting 93-97% bare.
Main text 2,990 words.

Co-Authored-By: Claude Opus 5.5 <noreply@anthropic.com>
Claude-Session: https://claude.ai/code/session_013TkounLTBFVQRstE3VnhkM
</commit_message>
<xml_diff>
--- a/JACR_3_Manuscript_masked.docx
+++ b/JACR_3_Manuscript_masked.docx
@@ -24,7 +24,7 @@
         <w:spacing w:after="160"/>
       </w:pPr>
       <w:r>
-        <w:t>Word count: 2,978 (Introduction through Take-Home Points; excluding abstract, references, tables and figure legends); Tables: 4; Figures: 3; Supplemental material: Supplements 1–3</w:t>
+        <w:t>Word count: 2,990 (Introduction through Take-Home Points; excluding abstract, references, tables and figure legends); Tables: 4; Figures: 3; Supplemental material: Supplements 1–3</w:t>
       </w:r>
     </w:p>
     <w:p>
@@ -6942,7 +6942,7 @@
         <w:spacing w:after="160"/>
       </w:pPr>
       <w:r>
-        <w:t>Malrotation was reported in 53.8% of the surgically confirmed children who underwent ultrasound, compared with 93–97% in the 2025 multicenter series [13] and a pooled 94% in meta-analysis [11], both in children investigated for suspicion. These figures are not interchangeable: ours is conditioned on confirmed disease and on the indications that selected these children, so the difference combines case-mix with technique. The audit nonetheless shows the technical component to be real. The published figures derive from examinations that assessed D3, the most accurate single sign in the 2025 multicenter series [13], and the duodenojejunal junction, often with enteric fluid, in readers alert to the diagnosis [15–17], whereas ours almost never did. The 2021 systematic review likewise found better performance where enteric fluid was given before the examination [11].</w:t>
+        <w:t>Malrotation was reported in 53.8% of the surgically confirmed children who underwent ultrasound, compared with 93% (original reports) and 97% (blinded review) in the 2025 multicenter series, which excluded non-diagnostic and equivocal examinations [13], and a pooled 94% in meta-analysis [11], both in children investigated for suspicion. These figures are not interchangeable: ours is conditioned on confirmed disease and on the indications that selected these children, so the difference combines case-mix with technique. The audit nonetheless shows the technical component to be real. The published figures derive from examinations that assessed D3, the most accurate single sign in the 2025 multicenter series [13], and the duodenojejunal junction, often with enteric fluid, in readers alert to the diagnosis [15–17], whereas ours almost never did. The 2021 systematic review likewise found better performance where enteric fluid was given before the examination [11].</w:t>
       </w:r>
     </w:p>
     <w:p>
@@ -7291,7 +7291,7 @@
         <w:rPr>
           <w:sz w:val="20"/>
         </w:rPr>
-        <w:t xml:space="preserve">4. Menghwani H, Piplani R, Yhoshu E, et al. Delayed presentation of malrotation: case series and literature review. </w:t>
+        <w:t xml:space="preserve">4. Menghwani H, Piplani R, Yhoshu E, Jagdish B, Sree BS. Delayed presentation of malrotation: case series and literature review. </w:t>
       </w:r>
       <w:r>
         <w:rPr>
@@ -7435,7 +7435,7 @@
         <w:rPr>
           <w:sz w:val="20"/>
         </w:rPr>
-        <w:t xml:space="preserve">10. Sodhi KS, Bhatia A, Saxena AK, et al. Anticlockwise swirl of mesenteric vessels: a normal CT appearance, retrospective analysis of 200 pediatric patients. </w:t>
+        <w:t xml:space="preserve">10. Sodhi KS, Bhatia A, Saxena AK, Rao KLN, Menon P, Khandelwal N. Anticlockwise swirl of mesenteric vessels: a normal CT appearance, retrospective analysis of 200 pediatric patients. </w:t>
       </w:r>
       <w:r>
         <w:rPr>
@@ -7555,7 +7555,7 @@
         <w:rPr>
           <w:sz w:val="20"/>
         </w:rPr>
-        <w:t xml:space="preserve">15. McCurdie FK, Meshaka R, Leung G, et al. Ultrasound for infantile midgut malrotation: techniques, pearls, and pitfalls. </w:t>
+        <w:t xml:space="preserve">15. McCurdie FK, Meshaka R, Leung G, Billington J, Watson TA. Ultrasound for infantile midgut malrotation: techniques, pearls, and pitfalls. </w:t>
       </w:r>
       <w:r>
         <w:rPr>
@@ -7579,7 +7579,7 @@
         <w:rPr>
           <w:sz w:val="20"/>
         </w:rPr>
-        <w:t xml:space="preserve">16. Menten R, Reding R, Godding V, et al. Sonographic assessment of the retroperitoneal position of the third portion of the duodenum: an indicator of normal intestinal rotation. </w:t>
+        <w:t xml:space="preserve">16. Menten R, Reding R, Godding V, Dumitriu DI, Clapuyt P. Sonographic assessment of the retroperitoneal position of the third portion of the duodenum: an indicator of normal intestinal rotation. </w:t>
       </w:r>
       <w:r>
         <w:rPr>
@@ -7651,7 +7651,7 @@
         <w:rPr>
           <w:sz w:val="20"/>
         </w:rPr>
-        <w:t xml:space="preserve">19. von Elm E, Altman DG, Egger M, et al. The Strengthening the Reporting of Observational Studies in Epidemiology (STROBE) statement: guidelines for reporting observational studies. </w:t>
+        <w:t xml:space="preserve">19. von Elm E, Altman DG, Egger M, Pocock SJ, Gøtzsche PC, Vandenbroucke JP; STROBE Initiative. The Strengthening the Reporting of Observational Studies in Epidemiology (STROBE) statement: guidelines for reporting observational studies. </w:t>
       </w:r>
       <w:r>
         <w:rPr>

</xml_diff>

<commit_message>
State the two ultrasound readers' qualifications
Reader A was an ultrasound physician and reader B a pediatric surgeon, as
the authors confirmed. This is now stated in the Methods, the Table 3
footnote, Supplement 1 Section K3 and the cover letter. The main text is
2,996 words (limit <3,000).

Co-Authored-By: Claude Opus 5.5 <noreply@anthropic.com>
Claude-Session: https://claude.ai/code/session_013TkounLTBFVQRstE3VnhkM
</commit_message>
<xml_diff>
--- a/JACR_3_Manuscript_masked.docx
+++ b/JACR_3_Manuscript_masked.docx
@@ -24,7 +24,7 @@
         <w:spacing w:after="160" w:line="480" w:lineRule="auto"/>
       </w:pPr>
       <w:r>
-        <w:t>Word count: 2,989 (Introduction through Take-Home Points; excluding abstract, references, tables and figure legends); Tables: 4; Figures: 3; Supplemental material: Supplements 1–3</w:t>
+        <w:t>Word count: 2,996 (Introduction through Take-Home Points; excluding abstract, references, tables and figure legends); Tables: 4; Figures: 3; Supplemental material: Supplements 1–3</w:t>
       </w:r>
     </w:p>
     <w:p>
@@ -223,7 +223,7 @@
         <w:spacing w:after="160" w:line="480" w:lineRule="auto"/>
       </w:pPr>
       <w:r>
-        <w:t>Each ultrasound index unit was coded by two readers working independently from the findings and conclusion text against written criteria for twelve elements, from D3 and the duodenojejunal junction to the whirlpool sign and limiting bowel gas (Table 3). Technique elements were counted as documented whether the finding was normal or abnormal; the whirlpool sign, a finding, only where described as present. Agreement was assessed with Cohen kappa and disagreements adjudicated. Booking category and bedside performance were taken from the examination name, and CT and UGI landmarks were coded by text patterns (Supplement 1).</w:t>
+        <w:t>Each ultrasound index unit was coded by two readers, an ultrasound physician and a pediatric surgeon, working independently from the findings and conclusion text against written criteria for twelve elements, from D3 and the duodenojejunal junction to the whirlpool sign and limiting bowel gas (Table 3). Technique elements were counted as documented whether the finding was normal or abnormal; the whirlpool sign, a finding, only where described as present. Agreement was assessed with Cohen kappa and disagreements adjudicated. Booking category and bedside performance were taken from the examination name, and CT and UGI landmarks were coded by text patterns (Supplement 1).</w:t>
       </w:r>
     </w:p>
     <w:p>
@@ -7007,7 +7007,7 @@
           <w:i/>
           <w:sz w:val="17"/>
         </w:rPr>
-        <w:t>The index unit is the examination episode closest to operation, pooling all reports of that modality issued that day. Content was coded from the findings and conclusion text by two readers working independently against written criteria; 5 of 1,428 item codes differed and were adjudicated against the criteria (Supplement 1, Section K). This is an audit of what was recorded and is a lower bound on what was performed: an element assessed but not documented cannot be distinguished from one never assessed. Technique elements count as documented whether the finding was normal or abnormal; the artery–vein relationship counts only where the position of the two vessels relative to each other was stated, and the whirlpool sign only where it was described as present. Enteric fluid administration counts only examinations stating that fluid was given (oral contrast or nasogastric instillation); observed luminal fluid without a stated route was not counted. Booking categories were coded from the examination name and are not mutually exclusive: 28 sessions were booked as both a gastrointestinal and a great-vessel study. Denominators of fewer than 10 are shown without a percentage.</w:t>
+        <w:t>The index unit is the examination episode closest to operation, pooling all reports of that modality issued that day. Content was coded from the findings and conclusion text by two readers, an ultrasound physician and a pediatric surgeon, working independently against written criteria; 5 of 1,428 item codes differed and were adjudicated against the criteria (Supplement 1, Section K). This is an audit of what was recorded and is a lower bound on what was performed: an element assessed but not documented cannot be distinguished from one never assessed. Technique elements count as documented whether the finding was normal or abnormal; the artery–vein relationship counts only where the position of the two vessels relative to each other was stated, and the whirlpool sign only where it was described as present. Enteric fluid administration counts only examinations stating that fluid was given (oral contrast or nasogastric instillation); observed luminal fluid without a stated route was not counted. Booking categories were coded from the examination name and are not mutually exclusive: 28 sessions were booked as both a gastrointestinal and a great-vessel study. Denominators of fewer than 10 are shown without a percentage.</w:t>
       </w:r>
     </w:p>
     <w:p>

</xml_diff>

<commit_message>
Confirm the data source and ultrasound reporters
The authors confirmed that the database export was by diagnosis and that
ultrasound was reported by ultrasound physicians. The Methods now say
"reported by" rather than "performed and reported by", which is all that
was confirmed. Main text 2,977 words.

Co-Authored-By: Claude Opus 5.5 <noreply@anthropic.com>
Claude-Session: https://claude.ai/code/session_013TkounLTBFVQRstE3VnhkM
</commit_message>
<xml_diff>
--- a/JACR_3_Manuscript_masked.docx
+++ b/JACR_3_Manuscript_masked.docx
@@ -24,7 +24,7 @@
         <w:spacing w:after="160" w:line="480" w:lineRule="auto"/>
       </w:pPr>
       <w:r>
-        <w:t>Word count: 2,979 (Introduction through Take-Home Points; excluding abstract, references, tables and figure legends); Tables: 4; Figures: 3; Supplemental material: Supplements 1–3</w:t>
+        <w:t>Word count: 2,977 (Introduction through Take-Home Points; excluding abstract, references, tables and figure legends); Tables: 4; Figures: 3; Supplemental material: Supplements 1–3</w:t>
       </w:r>
     </w:p>
     <w:p>
@@ -207,7 +207,7 @@
         <w:spacing w:after="160" w:line="480" w:lineRule="auto"/>
       </w:pPr>
       <w:r>
-        <w:t>Ultrasound was performed and reported by ultrasound physicians, and CT and the UGI series by radiologists, during routine care, unaware of the operative findings but not blinded to clinical history or previous imaging, and not by a designated reader group. Reports were free text, with no structured malrotation template in use. The department reports no change in ultrasound equipment, reporting staff or protocol during the study period, and attributes the change in practice from about 2021 to growing awareness of the diagnosis; this account was given retrospectively rather than recorded at the time.</w:t>
+        <w:t>Ultrasound was reported by ultrasound physicians, and CT and the UGI series by radiologists, during routine care, unaware of the operative findings but not blinded to clinical history or previous imaging, and not by a designated reader group. Reports were free text, with no structured malrotation template in use. The department reports no change in ultrasound equipment, reporting staff or protocol during the study period, and attributes the change in practice from about 2021 to growing awareness of the diagnosis; this account was given retrospectively rather than recorded at the time.</w:t>
       </w:r>
     </w:p>
     <w:p>

</xml_diff>

<commit_message>
State that neither ultrasound reader reported an audited examination
The authors confirmed that neither of the two readers who coded the
ultrasound report content (the ultrasound physician and the pediatric
surgeon, both authors) issued any of the audited ultrasound reports. The
Methods, the Table 3 note and Supplement 1 (K3) now say so. To make room
under the word limit, "that other departments can apply" is cut from the
last paragraph of the Introduction, where the Discussion and the Take-Home
Points already say it.

Main text 2,998 words, abstract 249. jacr_check passes; verify_numbers.py:
311 rows, 265 consistent, 46 definitional, 0 inconsistent.

Co-Authored-By: Claude Sonnet 5.5 <noreply@anthropic.com>
Claude-Session: https://claude.ai/code/session_013TkounLTBFVQRstE3VnhkM
</commit_message>
<xml_diff>
--- a/JACR_3_Manuscript_masked.docx
+++ b/JACR_3_Manuscript_masked.docx
@@ -24,7 +24,7 @@
         <w:spacing w:after="160" w:line="480" w:lineRule="auto"/>
       </w:pPr>
       <w:r>
-        <w:t>Word count: 2,996 (Introduction through Take-Home Points; excluding abstract, references, tables and figure legends); Tables: 4; Figures: 3; Supplemental material: Supplements 1–4</w:t>
+        <w:t>Word count: 2,998 (Introduction through Take-Home Points; excluding abstract, references, tables and figure legends); Tables: 4; Figures: 3; Supplemental material: Supplements 1–4</w:t>
       </w:r>
     </w:p>
     <w:p>
@@ -142,7 +142,7 @@
         <w:spacing w:after="160" w:line="480" w:lineRule="auto"/>
       </w:pPr>
       <w:r>
-        <w:t>We therefore audited 13.6 years of routine reports at a tertiary children's hospital. Because every child had surgically confirmed malrotation, the study measures how often the disease was reported and with what documented content, not how accurate the tests are. The UGI series and CT are reported alongside ultrasound to show where ultrasound sat in the diagnostic pathway, not to rank them. The audit criteria are provided as a minimum reporting dataset that other departments can apply (Supplement 4).</w:t>
+        <w:t>We therefore audited 13.6 years of routine reports at a tertiary children's hospital. Because every child had surgically confirmed malrotation, the study measures how often the disease was reported and with what documented content, not how accurate the tests are. The UGI series and CT are reported alongside ultrasound to show where ultrasound sat in the diagnostic pathway, not to rank them. The audit criteria are provided as a minimum reporting dataset (Supplement 4).</w:t>
       </w:r>
     </w:p>
     <w:p>
@@ -223,7 +223,7 @@
         <w:spacing w:after="160" w:line="480" w:lineRule="auto"/>
       </w:pPr>
       <w:r>
-        <w:t>Each ultrasound index examination was coded by two readers, an ultrasound physician and a pediatric surgeon, both authors, working independently from the findings and conclusion text against written criteria for twelve elements, from D3 and the duodenojejunal junction to the whirlpool sign and limiting bowel gas (Table 3). Technique elements were counted as documented whether the finding was normal or abnormal; the whirlpool sign, a finding, only where described as present. Agreement was assessed with Cohen kappa and disagreements adjudicated. Booking category and bedside performance were taken from the examination name, and CT and UGI landmarks were coded by text patterns (Supplement 1).</w:t>
+        <w:t>Each ultrasound index examination was coded by two readers, an ultrasound physician and a pediatric surgeon, both authors who had reported none of the examinations, working independently from the findings and conclusion text against written criteria for twelve elements, from D3 and the duodenojejunal junction to the whirlpool sign and limiting bowel gas (Table 3). Technique elements were counted as documented whether the finding was normal or abnormal; the whirlpool sign, a finding, only where described as present. Agreement was assessed with Cohen kappa and disagreements adjudicated. Booking category and bedside performance were taken from the examination name, and CT and UGI landmarks were coded by text patterns (Supplement 1).</w:t>
       </w:r>
     </w:p>
     <w:p>
@@ -7482,7 +7482,7 @@
           <w:i/>
           <w:sz w:val="17"/>
         </w:rPr>
-        <w:t>The index examination is the examination episode closest to operation, pooling all reports of that modality issued that day. Content was coded from the findings and conclusion text by two readers, an ultrasound physician and a pediatric surgeon, both authors, working independently against written criteria; 5 of 1,428 item codes differed and were adjudicated against the criteria (Supplement 1, Section K). This is an audit of what was recorded and is a lower bound on what was performed: an element assessed but not documented cannot be distinguished from one never assessed. Technique elements count as documented whether the finding was normal or abnormal; the artery–vein relationship counts only where the position of the two vessels relative to each other was stated, and the whirlpool sign only where it was described as present. Enteric fluid administration counts only examinations stating that fluid was given (oral contrast or nasogastric instillation); observed luminal fluid without a stated route was not counted. Booking categories were coded from the examination name and are not mutually exclusive: 28 sessions were booked as both gastrointestinal and great-vessel studies, 4 as gastrointestinal and pyloric, and 3 as great-vessel and pyloric. Denominators of fewer than 10 are shown without a percentage.</w:t>
+        <w:t>The index examination is the examination episode closest to operation, pooling all reports of that modality issued that day. Content was coded from the findings and conclusion text by two readers, an ultrasound physician and a pediatric surgeon, both authors who had reported none of the examinations, working independently against written criteria; 5 of 1,428 item codes differed and were adjudicated against the criteria (Supplement 1, Section K). This is an audit of what was recorded and is a lower bound on what was performed: an element assessed but not documented cannot be distinguished from one never assessed. Technique elements count as documented whether the finding was normal or abnormal; the artery–vein relationship counts only where the position of the two vessels relative to each other was stated, and the whirlpool sign only where it was described as present. Enteric fluid administration counts only examinations stating that fluid was given (oral contrast or nasogastric instillation); observed luminal fluid without a stated route was not counted. Booking categories were coded from the examination name and are not mutually exclusive: 28 sessions were booked as both gastrointestinal and great-vessel studies, 4 as gastrointestinal and pyloric, and 3 as great-vessel and pyloric. Denominators of fewer than 10 are shown without a percentage.</w:t>
       </w:r>
     </w:p>
     <w:p>

</xml_diff>

<commit_message>
Fix reference correspondence: ACR sentence in Discussion, add NegEx citation
Discussion paragraph 5 no longer says the 2020 ACR criteria weighed the 2021-2025
ultrasound evidence, which contradicted the Introduction; it now says low
documentation may bear on revisions of the 2020 guidance. "on the basis of" became
"based on" to stay under the word limit.

Methods now cites Chapman 2001 (NegEx) for the negation handling, and keeps the
NLP review for the rule-based approach in general. References are renumbered to 28
(Zeger 25, Firth 26, Heinze 27, El-Ali 28) and the export files regenerated.

Main text 2,999 words, abstract 248; number check 355 rows, 0 inconsistent.

Co-Authored-By: Claude Sonnet 5.5 <noreply@anthropic.com>
Claude-Session: https://claude.ai/code/session_013TkounLTBFVQRstE3VnhkM
</commit_message>
<xml_diff>
--- a/JACR_3_Manuscript_masked.docx
+++ b/JACR_3_Manuscript_masked.docx
@@ -24,7 +24,7 @@
         <w:spacing w:after="160" w:line="480" w:lineRule="auto"/>
       </w:pPr>
       <w:r>
-        <w:t>Word count: 2,998 (Introduction through Take-Home Points; excluding abstract, references, tables and figure legends); Tables: 4; Figures: 3; Supplemental material: Supplements 1–4</w:t>
+        <w:t>Word count: 2,999 (Introduction through Take-Home Points; excluding abstract, references, tables and figure legends); Tables: 4; Figures: 3; Supplemental material: Supplements 1–4</w:t>
       </w:r>
     </w:p>
     <w:p>
@@ -239,7 +239,7 @@
         <w:spacing w:after="160" w:line="480" w:lineRule="auto"/>
       </w:pPr>
       <w:r>
-        <w:t>Report text was classified using a rule-based, clause-level algorithm with explicit negation handling [23] (Supplement 1). A pediatric surgeon, one of the authors, blinded to the operative findings adjudicated 32 reports: agreement was 92% (Cohen kappa 0.83, 95% CI 0.61–1.00) in a stratified random sample of 24, and a targeted review of 8 suspected discordances found 5 further under-calls, excluded from the agreement statistics. A two-directional screen of every index examination then returned nine positives that no diagnostic term or sign pattern supported, three of which source review confirmed as over-calls. All errors were corrected; because adjudication read the whole report, the final label is the algorithmic label after review, not the conclusion alone. With a single adjudicator, interobserver agreement on the detection label could not be estimated.</w:t>
+        <w:t>Report text was classified using a rule-based, clause-level algorithm [23] with explicit negation handling [24] (Supplement 1). A pediatric surgeon, one of the authors, blinded to the operative findings adjudicated 32 reports: agreement was 92% (Cohen kappa 0.83, 95% CI 0.61–1.00) in a stratified random sample of 24, and a targeted review of 8 suspected discordances found 5 further under-calls, excluded from the agreement statistics. A two-directional screen of every index examination then returned nine positives that no diagnostic term or sign pattern supported, three of which source review confirmed as over-calls. All errors were corrected; because adjudication read the whole report, the final label is the algorithmic label after review, not the conclusion alone. With a single adjudicator, interobserver agreement on the detection label could not be estimated.</w:t>
       </w:r>
     </w:p>
     <w:p>
@@ -255,7 +255,7 @@
         <w:spacing w:after="160" w:line="480" w:lineRule="auto"/>
       </w:pPr>
       <w:r>
-        <w:t>Detection rates are presented with denominators and Wilson 95% confidence intervals (CIs). Between-modality comparison used a generalized estimating equation (GEE) logistic model [24] with an exchangeable working correlation, patient-level clustering and cluster-robust standard errors, unadjusted and adjusted for era (2012–2018 vs 2019–2026) and age group (≤28 days, 29 days–1 year, &gt;1 year), with standardized detection and cluster-bootstrap CIs. Modalities a child did not undergo are unobserved outcomes, not missing at random here, so these coefficients describe reporting among children who underwent each test. A pre-specified modality-by-volvulus interaction was not estimable, no ultrasound examination being positive among the five children without volvulus; a Firth penalized estimate is given in Supplement 2 [25, 26]. In the subgroup that underwent all three modalities, detection was compared using the Cochran Q test, the exact McNemar test and paired differences with bootstrap CIs (Supplement 2). The temporal change was explored, after inspection of the data, using modality-specific logistic models of detection on era before and after adding one covariate (booking category or contrast enhancement), reported as odds ratios and average marginal effects (Table 4); the era boundary was varied from 2019 to 2022 and era-by-covariate interactions fitted. Sensitivity analyses varied the outcome definition, index examination, interval to operation and ultrasound denominator (Supplement 2). P values were not adjusted for multiplicity; Supplement 2 lists which analyses were pre-specified. Analyses used Python 3.11 (statsmodels 0.15, SciPy 1.17).</w:t>
+        <w:t>Detection rates are presented with denominators and Wilson 95% confidence intervals (CIs). Between-modality comparison used a generalized estimating equation (GEE) logistic model [25] with an exchangeable working correlation, patient-level clustering and cluster-robust standard errors, unadjusted and adjusted for era (2012–2018 vs 2019–2026) and age group (≤28 days, 29 days–1 year, &gt;1 year), with standardized detection and cluster-bootstrap CIs. Modalities a child did not undergo are unobserved outcomes, not missing at random here, so these coefficients describe reporting among children who underwent each test. A pre-specified modality-by-volvulus interaction was not estimable, no ultrasound examination being positive among the five children without volvulus; a Firth penalized estimate is given in Supplement 2 [26, 27]. In the subgroup that underwent all three modalities, detection was compared using the Cochran Q test, the exact McNemar test and paired differences with bootstrap CIs (Supplement 2). The temporal change was explored, after inspection of the data, using modality-specific logistic models of detection on era before and after adding one covariate (booking category or contrast enhancement), reported as odds ratios and average marginal effects (Table 4); the era boundary was varied from 2019 to 2022 and era-by-covariate interactions fitted. Sensitivity analyses varied the outcome definition, index examination, interval to operation and ultrasound denominator (Supplement 2). P values were not adjusted for multiplicity; Supplement 2 lists which analyses were pre-specified. Analyses used Python 3.11 (statsmodels 0.15, SciPy 1.17).</w:t>
       </w:r>
     </w:p>
     <w:p>
@@ -400,7 +400,7 @@
         <w:spacing w:after="160" w:line="480" w:lineRule="auto"/>
       </w:pPr>
       <w:r>
-        <w:t>Malrotation or volvulus was named in 54.7% of the surgically confirmed children who underwent ultrasound, compared with 93% in the original clinical reports and 97% on blinded review in the 2025 multicenter series, which excluded non-diagnostic and equivocal examinations [13] (in a multi-institutional cohort, 25.7% of examinations for malrotation were non-diagnostic on the original report [27]), and a pooled 94% in meta-analysis [11], both in children investigated for suspicion. These figures are not interchangeable: ours is conditioned on confirmed disease and on the indications that selected these children, theirs on those exclusions, so the difference combines case mix, examination quality and technique in proportions this audit cannot separate. What it does show is that the elements to which published performance is attributed were almost never documented here: D3 [16, 17], the most accurate single sign in the 2025 series [13]; the duodenojejunal junction [12, 15]; and enteric fluid, associated with better performance in meta-analysis [11].</w:t>
+        <w:t>Malrotation or volvulus was named in 54.7% of the surgically confirmed children who underwent ultrasound, compared with 93% in the original clinical reports and 97% on blinded review in the 2025 multicenter series, which excluded non-diagnostic and equivocal examinations [13] (in a multi-institutional cohort, 25.7% of examinations for malrotation were non-diagnostic on the original report [28]), and a pooled 94% in meta-analysis [11], both in children investigated for suspicion. These figures are not interchangeable: ours is conditioned on confirmed disease and on the indications that selected these children, theirs on those exclusions, so the difference combines case mix, examination quality and technique in proportions this audit cannot separate. What it does show is that the elements to which published performance is attributed were almost never documented here: D3 [16, 17], the most accurate single sign in the 2025 series [13]; the duodenojejunal junction [12, 15]; and enteric fluid, associated with better performance in meta-analysis [11].</w:t>
       </w:r>
     </w:p>
     <w:p>
@@ -424,7 +424,7 @@
         <w:spacing w:after="160" w:line="480" w:lineRule="auto"/>
       </w:pPr>
       <w:r>
-        <w:t>The low documentation may bear on departments adopting an ultrasound-first pathway on the basis of sensitivities of 93–97%, and on guidance weighing that evidence [19]: published performance may not apply where examinations differ from those that produced it. Unlike accuracy, documentation needs no reference standard and can be audited prospectively in every examination requested for suspected malrotation. Supplement 4 sets out the audited elements as a minimum reporting dataset, with this audit as the baseline for a second cycle. These data cannot estimate the negative predictive value of a routine report.</w:t>
+        <w:t>The low documentation may bear on departments adopting an ultrasound-first pathway based on sensitivities of 93–97%, and on revisions of the 2020 ACR guidance [19]: published performance may not apply where examinations differ from those that produced it. Unlike accuracy, documentation needs no reference standard and can be audited prospectively in every examination requested for suspected malrotation. Supplement 4 sets out the audited elements as a minimum reporting dataset, with this audit as the baseline for a second cycle. These data cannot estimate the negative predictive value of a routine report.</w:t>
       </w:r>
     </w:p>
     <w:p>
@@ -1243,7 +1243,31 @@
         <w:rPr>
           <w:sz w:val="20"/>
         </w:rPr>
-        <w:t xml:space="preserve">24. Zeger SL, Liang KY. Longitudinal data analysis for discrete and continuous outcomes. </w:t>
+        <w:t xml:space="preserve">24. Chapman WW, Bridewell W, Hanbury P, Cooper GF, Buchanan BG. A simple algorithm for identifying negated findings and diseases in discharge summaries. </w:t>
+      </w:r>
+      <w:r>
+        <w:rPr>
+          <w:i/>
+          <w:sz w:val="20"/>
+        </w:rPr>
+        <w:t>J Biomed Inform</w:t>
+      </w:r>
+      <w:r>
+        <w:rPr>
+          <w:sz w:val="20"/>
+        </w:rPr>
+        <w:t>. 2001;34:301-310. doi:10.1006/jbin.2001.1029</w:t>
+      </w:r>
+    </w:p>
+    <w:p>
+      <w:pPr>
+        <w:spacing w:after="60" w:line="480" w:lineRule="auto"/>
+      </w:pPr>
+      <w:r>
+        <w:rPr>
+          <w:sz w:val="20"/>
+        </w:rPr>
+        <w:t xml:space="preserve">25. Zeger SL, Liang KY. Longitudinal data analysis for discrete and continuous outcomes. </w:t>
       </w:r>
       <w:r>
         <w:rPr>
@@ -1267,7 +1291,7 @@
         <w:rPr>
           <w:sz w:val="20"/>
         </w:rPr>
-        <w:t xml:space="preserve">25. Firth D. Bias reduction of maximum likelihood estimates. </w:t>
+        <w:t xml:space="preserve">26. Firth D. Bias reduction of maximum likelihood estimates. </w:t>
       </w:r>
       <w:r>
         <w:rPr>
@@ -1291,7 +1315,7 @@
         <w:rPr>
           <w:sz w:val="20"/>
         </w:rPr>
-        <w:t xml:space="preserve">26. Heinze G, Schemper M. A solution to the problem of separation in logistic regression. </w:t>
+        <w:t xml:space="preserve">27. Heinze G, Schemper M. A solution to the problem of separation in logistic regression. </w:t>
       </w:r>
       <w:r>
         <w:rPr>
@@ -1315,7 +1339,7 @@
         <w:rPr>
           <w:sz w:val="20"/>
         </w:rPr>
-        <w:t xml:space="preserve">27. El-Ali AM, Schiess DM, Van Tassel D, et al. Ultrasound for midgut volvulus and malrotation: frequency and predictors of a non-diagnostic examination in a multi-institutional cohort. </w:t>
+        <w:t xml:space="preserve">28. El-Ali AM, Schiess DM, Van Tassel D, et al. Ultrasound for midgut volvulus and malrotation: frequency and predictors of a non-diagnostic examination in a multi-institutional cohort. </w:t>
       </w:r>
       <w:r>
         <w:rPr>

</xml_diff>

<commit_message>
Align Discussion with the abstracts of refs 13 and 28
Discussion: the 93% and 97% from the 2025 multicenter series are malrotation
sensitivities; volvulus was 97% on both readings. The comparison now says so, and
"most accurate sign" is qualified as "for malrotation" (the whirlpool sign was the
most accurate for volvulus). Supplement 4 states that 25.7% non-diagnostic is for
malrotation and 13.5% for volvulus. Operations sheet and number check updated.

Main text 2,996 words; number check 355 rows, 0 inconsistent.

Co-Authored-By: Claude Sonnet 5.5 <noreply@anthropic.com>
Claude-Session: https://claude.ai/code/session_013TkounLTBFVQRstE3VnhkM
</commit_message>
<xml_diff>
--- a/JACR_3_Manuscript_masked.docx
+++ b/JACR_3_Manuscript_masked.docx
@@ -24,7 +24,7 @@
         <w:spacing w:after="160" w:line="480" w:lineRule="auto"/>
       </w:pPr>
       <w:r>
-        <w:t>Word count: 2,999 (Introduction through Take-Home Points; excluding abstract, references, tables and figure legends); Tables: 4; Figures: 3; Supplemental material: Supplements 1–4</w:t>
+        <w:t>Word count: 2,996 (Introduction through Take-Home Points; excluding abstract, references, tables and figure legends); Tables: 4; Figures: 3; Supplemental material: Supplements 1–4</w:t>
       </w:r>
     </w:p>
     <w:p>
@@ -400,7 +400,7 @@
         <w:spacing w:after="160" w:line="480" w:lineRule="auto"/>
       </w:pPr>
       <w:r>
-        <w:t>Malrotation or volvulus was named in 54.7% of the surgically confirmed children who underwent ultrasound, compared with 93% in the original clinical reports and 97% on blinded review in the 2025 multicenter series, which excluded non-diagnostic and equivocal examinations [13] (in a multi-institutional cohort, 25.7% of examinations for malrotation were non-diagnostic on the original report [28]), and a pooled 94% in meta-analysis [11], both in children investigated for suspicion. These figures are not interchangeable: ours is conditioned on confirmed disease and on the indications that selected these children, theirs on those exclusions, so the difference combines case mix, examination quality and technique in proportions this audit cannot separate. What it does show is that the elements to which published performance is attributed were almost never documented here: D3 [16, 17], the most accurate single sign in the 2025 series [13]; the duodenojejunal junction [12, 15]; and enteric fluid, associated with better performance in meta-analysis [11].</w:t>
+        <w:t>Malrotation or volvulus was named in 54.7% of the surgically confirmed children who underwent ultrasound, compared with 93–97% for malrotation and 97% for volvulus in the 2025 multicenter series, which excluded non-diagnostic and equivocal examinations [13] (in a multi-institutional cohort, 25.7% of examinations for malrotation were non-diagnostic on the original report [28]), and a pooled 94% in meta-analysis [11], both in children investigated for suspicion. These figures are not interchangeable: ours is conditioned on confirmed disease and on the indications that selected these children, theirs on those exclusions, so the difference combines case mix, examination quality and technique in proportions this audit cannot separate. What it does show is that the elements to which published performance is attributed were almost never documented here: D3 [16, 17], the most accurate sign for malrotation in the 2025 series [13]; the duodenojejunal junction [12, 15]; and enteric fluid, associated with better performance in meta-analysis [11].</w:t>
       </w:r>
     </w:p>
     <w:p>

</xml_diff>

<commit_message>
Polish the English of the manuscript text
Shorter sentences, fewer repeated clauses and more standard phrasing in the
abstract, Introduction, Methods, Results, Discussion, Limitations, Take-Home
Points, supplement list and figure legends. Numbers, number words, reference
numbers and abbreviations are unchanged, as is the statistical analysis paragraph
and the Declarations. Main text 2,976 words; number check 354 rows, 0 inconsistent.

Co-Authored-By: Claude Sonnet 5.5 <noreply@anthropic.com>
Claude-Session: https://claude.ai/code/session_013TkounLTBFVQRstE3VnhkM
</commit_message>
<xml_diff>
--- a/JACR_3_Manuscript_masked.docx
+++ b/JACR_3_Manuscript_masked.docx
@@ -24,7 +24,7 @@
         <w:spacing w:after="160" w:line="480" w:lineRule="auto"/>
       </w:pPr>
       <w:r>
-        <w:t>Word count: 2,996 (Introduction through Take-Home Points; excluding abstract, references, tables and figure legends); Tables: 4; Figures: 3; Supplemental material: Supplements 1–4</w:t>
+        <w:t>Word count: 2,976 (Introduction through Take-Home Points; excluding abstract, references, tables and figure legends); Tables: 4; Figures: 3; Supplemental material: Supplements 1–4</w:t>
       </w:r>
     </w:p>
     <w:p>
@@ -60,7 +60,7 @@
         <w:t>Methods:</w:t>
       </w:r>
       <w:r>
-        <w:t xml:space="preserve"> Retrospective case-only report audit at one tertiary children's hospital (December 2012–June 2026). The preoperative examination closest to operation was classified by a rule-based algorithm with blinded surgical adjudication, and separately audited for documented technical content (ultrasound by two independent readers). Because the cohort was surgically confirmed, the outcome is report-level detection among tested children, with Wilson 95% CIs; specificity, predictive values and comparative accuracy are not estimable.</w:t>
+        <w:t xml:space="preserve"> Retrospective case-only report audit at one tertiary children's hospital (December 2012–June 2026). The preoperative examination closest to operation was classified by a rule-based algorithm with blinded surgical adjudication, and separately audited for documented technical content (ultrasound by two independent readers). As the cohort was surgically confirmed, the outcome was report-level detection among tested children, with Wilson 95% CIs; specificity, predictive values and comparative accuracy are not estimable.</w:t>
       </w:r>
     </w:p>
     <w:p>
@@ -118,7 +118,7 @@
         <w:spacing w:after="160" w:line="480" w:lineRule="auto"/>
       </w:pPr>
       <w:r>
-        <w:t>Intestinal malrotation predisposes to midgut volvulus, which can progress within hours to bowel necrosis [1] and lead to short-bowel syndrome or death [1, 2]. Bilious vomiting in a neonate is a surgical emergency until malrotation with volvulus has been excluded, although older children may present atypically and be diagnosed late [3, 4].</w:t>
+        <w:t>Intestinal malrotation predisposes to midgut volvulus, which can progress to bowel necrosis within hours [1] and lead to short-bowel syndrome or death [1, 2]. Bilious vomiting in a neonate is a surgical emergency until malrotation with volvulus has been excluded, although older children may present atypically and be diagnosed late [3, 4].</w:t>
       </w:r>
     </w:p>
     <w:p>
@@ -126,7 +126,7 @@
         <w:spacing w:after="160" w:line="480" w:lineRule="auto"/>
       </w:pPr>
       <w:r>
-        <w:t>The upper gastrointestinal (UGI) contrast series has long been the reference imaging test, based on the position of the duodenojejunal junction and the course of the proximal small bowel [5–7], despite well-described mimics [8]. Abdominal CT is not a dedicated test, and the mesenteric swirl it may show is neither reliably present nor specific in children [9, 10]. The field has moved toward ultrasound: series report sensitivities of 93–97%, a systematic review of 17 studies and 2,257 children estimated a pooled sensitivity of 94% [11–13], and a single-center study of 539 children supported ultrasound as a safe first-line test [14]. This performance is attributed to specific technical elements rather than to the modality itself: the third portion of the duodenum (D3), the duodenojejunal junction, the superior mesenteric artery–vein relationship, enteric fluid and dynamic graded compression [12, 13, 15–17]. The same literature records these elements as demanding and not universally achievable, and D3 position alone as insufficient for diagnosis [18]. The 2020 ACR Appropriateness Criteria, which predate most of this evidence, rate ultrasound as "may be appropriate" and the UGI series as "usually appropriate" for bilious vomiting in infants older than 2 days [19].</w:t>
+        <w:t>The upper gastrointestinal (UGI) contrast series has long been the reference imaging test, based on the position of the duodenojejunal junction and the course of the proximal small bowel [5–7], despite well-described mimics [8]. Abdominal CT is not a dedicated test, and the mesenteric swirl it may show is neither reliably present nor specific in children [9, 10]. Practice has moved toward ultrasound: series report sensitivities of 93–97%, a systematic review of 17 studies and 2,257 children estimated a pooled sensitivity of 94% [11–13], and a single-center study of 539 children supported ultrasound as a safe first-line test [14]. This performance is attributed to specific technical elements rather than to the modality itself: the third portion of the duodenum (D3), the duodenojejunal junction, the superior mesenteric artery–vein relationship, enteric fluid and dynamic graded compression [12, 13, 15–17]. The same literature describes these elements as demanding and not universally achievable, and D3 position alone as insufficient for diagnosis [18]. The 2020 ACR Appropriateness Criteria, which predate most of this evidence, rate ultrasound as "may be appropriate" and the UGI series as "usually appropriate" for bilious vomiting in infants older than 2 days [19].</w:t>
       </w:r>
     </w:p>
     <w:p>
@@ -134,7 +134,7 @@
         <w:spacing w:after="160" w:line="480" w:lineRule="auto"/>
       </w:pPr>
       <w:r>
-        <w:t>A report audit of the UGI series for malrotation found discrepancies with blinded re-reading and proposed a structured template [20], but whether routine reports from a general pediatric ultrasound service document the elements to which that performance is attributed, and how this relates to whether the diagnosis is reported, has not to our knowledge been examined at scale.</w:t>
+        <w:t>A report audit of the UGI series for malrotation found discrepancies on blinded re-reading and proposed a structured template [20]. To our knowledge, no study has examined at scale whether routine reports from a general pediatric ultrasound service document the elements to which this performance is attributed, or how documentation relates to whether the diagnosis is reported.</w:t>
       </w:r>
     </w:p>
     <w:p>
@@ -142,7 +142,7 @@
         <w:spacing w:after="160" w:line="480" w:lineRule="auto"/>
       </w:pPr>
       <w:r>
-        <w:t>We therefore audited 13.6 years of routine reports at a tertiary children's hospital. Because every child had surgically confirmed malrotation, the study measures how often the disease was reported and with what documented content, not how accurate the tests are. The UGI series and CT are reported alongside ultrasound to show where ultrasound sat in the diagnostic pathway, not to rank them. The audit criteria are provided as a minimum reporting dataset (Supplement 4).</w:t>
+        <w:t>We therefore audited 13.6 years of routine reports at a tertiary children's hospital. Because every child had surgically confirmed malrotation, the study measures how often the disease was reported and with what documented content, not the accuracy of the tests. The UGI series and CT are reported alongside ultrasound to show where ultrasound sat in the diagnostic pathway, not to rank them. The audit criteria are provided as a minimum reporting dataset (Supplement 4).</w:t>
       </w:r>
     </w:p>
     <w:p>
@@ -166,7 +166,7 @@
         <w:spacing w:after="160" w:line="480" w:lineRule="auto"/>
       </w:pPr>
       <w:r>
-        <w:t xml:space="preserve">This was a retrospective, single-center, case-only report audit approved by the institutional review board with waiver of consent. Reporting follows STROBE [21]; STARD was not used, as the design is not that of a diagnostic accuracy study. The cohort includes no children in whom malrotation was suspected and excluded. The outcome is the </w:t>
+        <w:t xml:space="preserve">This was a retrospective, single-center, case-only report audit, approved by the institutional review board with waiver of consent. Reporting follows STROBE [21]; STARD was not used because this is not a diagnostic accuracy design. The cohort includes no children in whom malrotation was suspected and excluded. The outcome is the </w:t>
       </w:r>
       <w:r>
         <w:rPr>
@@ -175,7 +175,7 @@
         <w:t>report-level detection rate among surgically confirmed children who underwent the test</w:t>
       </w:r>
       <w:r>
-        <w:t>. We avoid the term "sensitivity", which does not transfer to children investigated for suspicion. Specificity, predictive values and any accuracy-based ranking cannot be estimated. The whirlpool sign is a sign of volvulus rather than of malrotation [22].</w:t>
+        <w:t>. We avoid the term "sensitivity" because the rate does not transfer to children investigated for suspicion. Specificity, predictive values and any accuracy-based ranking cannot be estimated. The whirlpool sign indicates volvulus rather than malrotation [22].</w:t>
       </w:r>
     </w:p>
     <w:p>
@@ -191,7 +191,7 @@
         <w:spacing w:after="160" w:line="480" w:lineRule="auto"/>
       </w:pPr>
       <w:r>
-        <w:t>The institutional clinical research database supplied the records of 711 children with a recorded diagnosis of intestinal malrotation between December 2012 and June 2026, including 559 operative records in 499 children. Every operative record was read, and operations whose operative diagnosis named intestinal malrotation or whose procedure was recorded as a Ladd procedure were selected (search strings in Supplement 1): 503 records in 465 children. The anchor operation was each child's first such operation. One author, with the imaging labels visible, re-read all operative records for 34 children whose anchor operation was not named as a malrotation procedure or followed earlier malrotation surgery: 19 were retained and 15 excluded, 6 in whom that operation did not confirm malrotation and 9 reoperations (Supplement 1). The remaining 450 consecutive children form the reference standard. Midgut volvulus was defined by an explicit operative statement of torsion or by a documented degree of midgut or mesenteric rotation, with no minimum degree required (see Limitations). No sample-size calculation was performed.</w:t>
+        <w:t>The institutional clinical research database supplied the records of 711 children with a recorded diagnosis of intestinal malrotation between December 2012 and June 2026, including 559 operative records in 499 children. Every operative record was read, and operations with an operative diagnosis of intestinal malrotation or a recorded Ladd procedure were selected (search strings in Supplement 1), giving 503 records in 465 children. The anchor operation was each child's first such operation. One author, with the imaging labels visible, re-read all operative records for 34 children whose anchor operation was not named as a malrotation procedure or followed earlier malrotation surgery; 19 were retained and 15 excluded (6 in whom that operation did not confirm malrotation and 9 reoperations; Supplement 1). The remaining 450 consecutive children form the reference standard. Midgut volvulus was defined by an explicit operative statement of torsion or a documented degree of midgut or mesenteric rotation, with no minimum degree required (see Limitations). No sample-size calculation was performed.</w:t>
       </w:r>
     </w:p>
     <w:p>
@@ -199,7 +199,7 @@
         <w:spacing w:after="160" w:line="480" w:lineRule="auto"/>
       </w:pPr>
       <w:r>
-        <w:t>Three modalities were evaluated: ultrasound (sessions booked as gastrointestinal, abdominal great-vessel or pyloric), abdominal CT and the UGI series; contrast enemas were not counted. For each child and modality, the index examination was the examination episode closest to operation, pooling every report of that modality issued that day, as the department routinely issues separate gastrointestinal and great-vessel reports for one ultrasound session. Operative times were recorded as dates only, so the 154 same-day reports and the 27 index examinations more than 7 days before operation were reviewed individually; three issued after the operation or for an unrelated earlier illness were removed. This yielded 723 index examinations from 761 reports; 32 earlier repeat examinations were not audited (Figure 1). The clinical indication was not retrievable, so confounding by indication is displayed in Table 1, not adjusted for.</w:t>
+        <w:t>Three modalities were evaluated: ultrasound (sessions booked as gastrointestinal, abdominal great-vessel or pyloric), abdominal CT and the UGI series; contrast enemas were not counted. For each child and modality, the index examination was the examination episode closest to operation, pooling every report of that modality issued that day, as the department routinely issues separate gastrointestinal and great-vessel reports for one ultrasound session. Operative times were recorded as dates only, so the 154 same-day reports and the 27 index examinations more than 7 days before operation were reviewed individually; three issued after the operation or concerning an unrelated earlier illness were removed. This yielded 723 index examinations from 761 reports; 32 earlier repeat examinations were not audited (Figure 1). The clinical indication was not retrievable, so confounding by indication is shown in Table 1, not adjusted for.</w:t>
       </w:r>
     </w:p>
     <w:p>
@@ -207,7 +207,7 @@
         <w:spacing w:after="160" w:line="480" w:lineRule="auto"/>
       </w:pPr>
       <w:r>
-        <w:t>Ultrasound was reported by ultrasound physicians, and CT and the UGI series by radiologists, during routine care, unaware of the operative findings but not blinded to clinical history or previous imaging, and not by a designated reader group. Reports were free text, with no structured malrotation template in use. The department reports no change in ultrasound equipment, reporting staff or protocol during the study period.</w:t>
+        <w:t>Ultrasound was reported by ultrasound physicians, and CT and the UGI series by radiologists, during routine care, unaware of the operative findings but not blinded to clinical history or previous imaging, and not by a designated reader group. Reports were free text, with no structured malrotation template in use. The department reported no change in ultrasound equipment, reporting staff or protocol during the study period.</w:t>
       </w:r>
     </w:p>
     <w:p>
@@ -223,7 +223,7 @@
         <w:spacing w:after="160" w:line="480" w:lineRule="auto"/>
       </w:pPr>
       <w:r>
-        <w:t>Each ultrasound index examination was coded by two readers, an ultrasound physician and a pediatric surgeon, both authors who had reported none of the examinations, working independently from the findings and conclusion text against written criteria for twelve elements, from D3 and the duodenojejunal junction to the whirlpool sign and limiting bowel gas (Table 3). Technique elements were counted as documented whether the finding was normal or abnormal; the whirlpool sign, a finding, only where described as present. Agreement was assessed with Cohen kappa and disagreements adjudicated. Booking category and bedside performance were taken from the examination name, and CT and UGI landmarks were coded by text patterns (Supplement 1).</w:t>
+        <w:t>Each ultrasound index examination was coded by two readers, an ultrasound physician and a pediatric surgeon, both authors who had reported none of the examinations, working independently from the findings and conclusion text against written criteria for twelve elements, from D3 and the duodenojejunal junction to the whirlpool sign and limiting bowel gas (Table 3). Technique elements were counted as documented whether the finding was normal or abnormal; the whirlpool sign, a finding, only where described as present. Agreement was assessed with Cohen kappa and disagreements adjudicated. Booking category and bedside performance were taken from the examination name; CT and UGI landmarks were coded by text patterns (Supplement 1).</w:t>
       </w:r>
     </w:p>
     <w:p>
@@ -231,7 +231,7 @@
         <w:spacing w:after="160" w:line="480" w:lineRule="auto"/>
       </w:pPr>
       <w:r>
-        <w:t>An examination was classified as positive when its conclusion named malrotation or midgut volvulus, including tentative phrasing, or described a modality-specific sign: for ultrasound, a whirlpool or an explicit statement of mesenteric vessel inversion; for the UGI series, a corkscrew or spring appearance or a malpositioned duodenojejunal junction; for CT, a mesenteric whirl or an abnormal duodenal position. Explicit negation was classified as negative, and isolated gastric volvulus was not counted. Because the whirlpool is both an audited element and a positivity criterion, and a conclusion may name volvulus without malrotation, detection was also computed counting only conclusions that named malrotation. Tentative phrasing is standard here, so the certainty tier of every positive conclusion was tabulated and the analyses repeated with "possible" tiers counted as negative.</w:t>
+        <w:t>An examination was classified as positive when its conclusion named malrotation or midgut volvulus, including tentative phrasing, or described a modality-specific sign: for ultrasound, a whirlpool or an explicit statement of mesenteric vessel inversion; for the UGI series, a corkscrew or spring appearance or a malpositioned duodenojejunal junction; for CT, a mesenteric whirl or an abnormal duodenal position. Explicit negation was classified as negative, and isolated gastric volvulus was not counted. Because the whirlpool is both an audited element and a positivity criterion, and a conclusion may name volvulus without malrotation, detection was also computed counting only conclusions that named malrotation. Tentative phrasing is common, so the certainty tier of every positive conclusion was tabulated and the analyses repeated with "possible" tiers counted as negative.</w:t>
       </w:r>
     </w:p>
     <w:p>
@@ -239,7 +239,7 @@
         <w:spacing w:after="160" w:line="480" w:lineRule="auto"/>
       </w:pPr>
       <w:r>
-        <w:t>Report text was classified using a rule-based, clause-level algorithm [23] with explicit negation handling [24] (Supplement 1). A pediatric surgeon, one of the authors, blinded to the operative findings adjudicated 32 reports: agreement was 92% (Cohen kappa 0.83, 95% CI 0.61–1.00) in a stratified random sample of 24, and a targeted review of 8 suspected discordances found 5 further under-calls, excluded from the agreement statistics. A two-directional screen of every index examination then returned nine positives that no diagnostic term or sign pattern supported, three of which source review confirmed as over-calls. All errors were corrected; because adjudication read the whole report, the final label is the algorithmic label after review, not the conclusion alone. With a single adjudicator, interobserver agreement on the detection label could not be estimated.</w:t>
+        <w:t>Report text was classified using a rule-based, clause-level algorithm [23] with explicit negation handling [24] (Supplement 1). A pediatric surgeon, one of the authors, blinded to the operative findings, adjudicated 32 reports. Agreement was 92% (Cohen kappa 0.83, 95% CI 0.61–1.00) in a stratified random sample of 24; a targeted review of 8 suspected discordances found 5 further under-calls, excluded from the agreement statistics. A two-directional screen of every index examination then returned nine positives that no diagnostic term or sign pattern supported; source review confirmed three as over-calls. All errors were corrected. Because adjudication read the whole report, the final label is the algorithmic label after review, not the conclusion alone. With a single adjudicator, interobserver agreement on the detection label could not be estimated.</w:t>
       </w:r>
     </w:p>
     <w:p>
@@ -279,7 +279,7 @@
         <w:spacing w:after="160" w:line="480" w:lineRule="auto"/>
       </w:pPr>
       <w:r>
-        <w:t>Of 450 children with surgically confirmed malrotation, 300 (66.7%) were neonates and 397 (88.2%) had midgut volvulus (Table 1). An index examination was available in 293 children for the UGI series, 313 for CT and 117 for ultrasound; 398 underwent at least one and 59 all three. The remaining 52 (11.6%) underwent none of the three, but all had other preoperative imaging; in four it was documented before transfer (Table 1, Figure 1).</w:t>
+        <w:t>Of 450 children with surgically confirmed malrotation, 300 (66.7%) were neonates and 397 (88.2%) had midgut volvulus (Table 1). An index examination was available in 293 children for the UGI series, 313 for CT and 117 for ultrasound; 398 underwent at least one and 59 all three. The remaining 52 (11.6%) underwent none of the three, but all had other preoperative imaging, documented before transfer in four (Table 1, Figure 1).</w:t>
       </w:r>
     </w:p>
     <w:p>
@@ -287,7 +287,7 @@
         <w:spacing w:after="160" w:line="480" w:lineRule="auto"/>
       </w:pPr>
       <w:r>
-        <w:t>The modality groups were not interchangeable (Table 1). Ultrasound was performed more often in children with volvulus, its use rising from 13% to 51% of operated children between eras. Among children who underwent more than one index test, the last preoperative test was the UGI series in 75.0% of those who received it, ultrasound in 36.8% (39/106) and CT in 19.2%; UGI detection was higher when it came last (80.0% [144/180] vs 70.0% [42/60] when it did not), which may reflect the pathway rather than the test.</w:t>
+        <w:t>The modality groups were not interchangeable (Table 1). Ultrasound was performed more often in children with volvulus, its use rising from 13% to 51% of operated children between eras. Among children who underwent more than one index test, the last preoperative test was the UGI series in 75.0% of those who received it, ultrasound in 36.8% (39/106) and CT in 19.2%. UGI detection was higher when it came last (80.0% [144/180] vs 70.0% [42/60] when it did not), which may reflect the pathway rather than the test.</w:t>
       </w:r>
     </w:p>
     <w:p>
@@ -327,7 +327,7 @@
         <w:spacing w:after="160" w:line="480" w:lineRule="auto"/>
       </w:pPr>
       <w:r>
-        <w:t>Of these three, only one, in 2022, followed D3 between the artery and the aorta and identified the duodenojejunal junction, as the published technique describes [16, 17].</w:t>
+        <w:t>Of these three, only one (in 2022) followed D3 between the artery and the aorta and identified the duodenojejunal junction, as the published technique describes [16, 17].</w:t>
       </w:r>
     </w:p>
     <w:p>
@@ -335,7 +335,7 @@
         <w:spacing w:after="160" w:line="480" w:lineRule="auto"/>
       </w:pPr>
       <w:r>
-        <w:t>The diagnosis was named in all 59 examinations recording a whirlpool and in 5 of the 58 without one (8.6%, 95% CI 3.7–18.6). This contrast is partly definitional, as a whirlpool is itself a positivity criterion, although all 59 conclusions also named malrotation explicitly. A whirlpool was recorded in 59 of the 112 children (52.7%) who underwent ultrasound and in whom operation confirmed midgut volvulus.</w:t>
+        <w:t>The diagnosis was named in all 59 examinations recording a whirlpool and in 5 of the 58 without one (8.6%, 95% CI 3.7–18.6). This contrast is partly definitional because a whirlpool is itself a positivity criterion, although all 59 conclusions also named malrotation explicitly. A whirlpool was recorded in 59 of the 112 children (52.7%) who underwent ultrasound and had operatively confirmed midgut volvulus.</w:t>
       </w:r>
     </w:p>
     <w:p>
@@ -392,7 +392,7 @@
         <w:spacing w:after="160" w:line="480" w:lineRule="auto"/>
       </w:pPr>
       <w:r>
-        <w:t>Over 13.6 years, routine ultrasound reports for children who proved to have intestinal malrotation rarely recorded the duodenal anatomy to which contemporary ultrasound accuracy is attributed: D3 or the duodenojejunal junction in three of 117 examinations, enteric fluid in two. The finding they did record was the whirlpool sign, present in about half of all examinations and of the children in whom operation confirmed volvulus. Such low documentation might be expected with free-text reports and no structured template, as here. Positive reports almost always described a whirlpool (59 of 64).</w:t>
+        <w:t>Over 13.6 years, routine ultrasound reports for children with surgically confirmed intestinal malrotation rarely recorded the duodenal anatomy to which contemporary ultrasound accuracy is attributed: D3 or the duodenojejunal junction in three of 117 examinations, enteric fluid in two. What they did record was the whirlpool sign, present in about half of all examinations and of the children with operatively confirmed volvulus. Such low documentation might be expected with free-text reports and no structured template, as here. Positive reports almost always described a whirlpool (59 of 64).</w:t>
       </w:r>
     </w:p>
     <w:p>
@@ -400,7 +400,7 @@
         <w:spacing w:after="160" w:line="480" w:lineRule="auto"/>
       </w:pPr>
       <w:r>
-        <w:t>Malrotation or volvulus was named in 54.7% of the surgically confirmed children who underwent ultrasound, compared with 93–97% for malrotation and 97% for volvulus in the 2025 multicenter series, which excluded non-diagnostic and equivocal examinations [13] (in a multi-institutional cohort, 25.7% of examinations for malrotation were non-diagnostic on the original report [28]), and a pooled 94% in meta-analysis [11], both in children investigated for suspicion. These figures are not interchangeable: ours is conditioned on confirmed disease and on the indications that selected these children, theirs on those exclusions, so the difference combines case mix, examination quality and technique in proportions this audit cannot separate. What it does show is that the elements to which published performance is attributed were almost never documented here: D3 [16, 17], the most accurate sign for malrotation in the 2025 series [13]; the duodenojejunal junction [12, 15]; and enteric fluid, associated with better performance in meta-analysis [11].</w:t>
+        <w:t>Malrotation or volvulus was named in 54.7% of the surgically confirmed children who underwent ultrasound. The 2025 multicenter series, which excluded non-diagnostic and equivocal examinations, reported 93–97% for malrotation and 97% for volvulus [13], and a meta-analysis pooled 94% [11], both in children investigated for suspicion. In a multi-institutional cohort, 25.7% of examinations for malrotation were non-diagnostic on the original report [28]. These figures are not interchangeable: ours is conditioned on confirmed disease and on the indications that selected these children, theirs on those exclusions, so the difference combines case mix, examination quality and technique in proportions this audit cannot separate. What the audit does show is that the elements to which published performance is attributed were almost never documented here: D3 [16, 17], the most accurate sign for malrotation in the 2025 series [13]; the duodenojejunal junction [12, 15]; and enteric fluid, which was associated with better performance in the meta-analysis [11].</w:t>
       </w:r>
     </w:p>
     <w:p>
@@ -416,7 +416,7 @@
         <w:spacing w:after="160" w:line="480" w:lineRule="auto"/>
       </w:pPr>
       <w:r>
-        <w:t>Two features of the design make the between-modality differences uninterpretable as accuracy. The reference standard is not independent of the index tests: the surgeon presumably knew the preoperative imaging, and a positive UGI series, the last preoperative test in 75.0% of children who had it with another index test, may often have precipitated the operation that confirmed the diagnosis, an incorporation bias asymmetrical between tests. The modalities were also used in different children for different reasons (Table 1), which no adjustment can undo.</w:t>
+        <w:t>Two features of the design make the between-modality differences uninterpretable as accuracy. The reference standard is not independent of the index tests: the surgeon presumably knew the preoperative imaging, and a positive UGI series (the last preoperative test in 75.0% of children who had it with another index test) may often have precipitated the operation that confirmed the diagnosis, an incorporation bias asymmetrical between tests. The modalities were also used in different children for different reasons (Table 1), which adjustment cannot correct.</w:t>
       </w:r>
     </w:p>
     <w:p>
@@ -440,7 +440,7 @@
         <w:spacing w:after="160" w:line="480" w:lineRule="auto"/>
       </w:pPr>
       <w:r>
-        <w:t>This is not a diagnostic accuracy study: detection among surgically confirmed children who underwent a test does not transfer to children investigated for suspicion [11, 13, 14]. The cohort contains only children who reached an operation, is weighted toward severe neonatal disease, and provides little information on older children with intermittent symptoms, incidental or non-volvulus malrotation, or stable outpatients. The 52 children without an index test were excluded from the denominators, an informative missingness, as were 9 whose operation followed earlier malrotation surgery. Excluding children whose operative record states a rotation below 360° changes prevalence from 88.2% to 84.0% without altering any conclusion (Supplement 2).</w:t>
+        <w:t>This is not a diagnostic accuracy study, and detection among surgically confirmed children who underwent a test does not transfer to children investigated for suspicion [11, 13, 14]. The cohort comprises only children who reached an operation, is weighted toward severe neonatal disease, and provides little information on older children with intermittent symptoms, incidental or non-volvulus malrotation, or stable outpatients. The 52 children without an index test were excluded from the denominators (informative missingness), as were 9 whose operation followed earlier malrotation surgery. Excluding children whose operative record states a rotation below 360° changes prevalence from 88.2% to 84.0% without altering any conclusion (Supplement 2).</w:t>
       </w:r>
     </w:p>
     <w:p>
@@ -448,7 +448,7 @@
         <w:spacing w:after="160" w:line="480" w:lineRule="auto"/>
       </w:pPr>
       <w:r>
-        <w:t>Index tests were classified from report text rather than blinded image review, so the study measures reported detection rather than achievable image-based accuracy; a finding seen but not recorded and an inadequate examination reported as normal cannot be distinguished, although the report is what clinicians act on. The certainty tiers were derived from the same text and, unlike the positive–negative label, were not separately adjudicated. Radiation dose could not be captured. This is one audit cycle at one center: whether the findings generalize, whether a structured report would raise documentation and whether documentation would raise detection are unknown.</w:t>
+        <w:t>Index tests were classified from report text, not blinded image review, so the study measures reported detection rather than achievable image-based accuracy; a finding seen but not recorded and an inadequate examination reported as normal cannot be distinguished, although the report is what clinicians act on. The certainty tiers were derived from the same text and, unlike the positive–negative label, were not separately adjudicated. Radiation dose could not be captured. This is one audit cycle at one center, so whether the findings generalize, whether a structured report would raise documentation and whether documentation would raise detection are unknown.</w:t>
       </w:r>
     </w:p>
     <w:p>
@@ -472,7 +472,7 @@
         <w:spacing w:after="160" w:line="480" w:lineRule="auto"/>
       </w:pPr>
       <w:r>
-        <w:t>• Positive ultrasound reports almost always described a whirlpool (59 of 64), a sign of volvulus, which was recorded in 59 of the 112 ultrasound-examined children with volvulus.</w:t>
+        <w:t>• Positive ultrasound reports almost always described a whirlpool (59 of 64), a sign of volvulus. It was recorded in 59 of the 112 ultrasound-examined children with volvulus.</w:t>
       </w:r>
     </w:p>
     <w:p>
@@ -480,7 +480,7 @@
         <w:spacing w:after="160" w:line="480" w:lineRule="auto"/>
       </w:pPr>
       <w:r>
-        <w:t>• These are report-level detection rates among surgically confirmed children, not sensitivities; they establish no specificity, predictive value or ranking of modalities, and are no argument against ultrasound-first pathways.</w:t>
+        <w:t>• These are report-level detection rates among surgically confirmed children, not sensitivities; they do not establish specificity, predictive value or ranking of modalities, and do not argue against ultrasound-first pathways.</w:t>
       </w:r>
     </w:p>
     <w:p>
@@ -524,7 +524,7 @@
         <w:t>Supplement 2.</w:t>
       </w:r>
       <w:r>
-        <w:t xml:space="preserve"> Between-modality generalized estimating equation models; the subgroup receiving all three examinations, with 48-h and 24-h timing sensitivity analyses; detection stratified by midgut volvulus and by age; detection of a volvulus-specific sign among children with confirmed volvulus; and sensitivity analyses varying the era boundary from 2019 to 2022, restricting midgut volvulus to a documented rotation of 360° or more, and taking the earliest rather than the closest preoperative examination as the index examination; and standardized detection under four definitions of a positive report, the timing and choice of the index examination, and ultrasound content by booking category.</w:t>
+        <w:t xml:space="preserve"> Between-modality generalized estimating equation models; the subgroup receiving all three examinations, with 48-h and 24-h timing sensitivity analyses; detection stratified by midgut volvulus and by age; detection of a volvulus-specific sign among children with confirmed volvulus; sensitivity analyses that vary the era boundary from 2019 to 2022, restrict midgut volvulus to a documented rotation of 360° or more, or take the earliest rather than the closest preoperative examination as the index examination; and standardized detection under four definitions of a positive report, the timing and choice of the index examination, and ultrasound content by booking category.</w:t>
       </w:r>
     </w:p>
     <w:p>
@@ -1379,7 +1379,7 @@
         <w:t>Figure 1. Study flow and the imaging received by children without an index test.</w:t>
       </w:r>
       <w:r>
-        <w:t xml:space="preserve"> Records of 711 children in the clinical research database, selection of 503 operative records in 465 children, exclusions after review of the anchor operation, availability of each preoperative index test, and reduction of 793 eligible preoperative reports to 723 index examination episodes. Every one of the 52 children who received none of the three index examinations nonetheless had other preoperative imaging, four of them documented before transfer; the breakdown is shown at right.</w:t>
+        <w:t xml:space="preserve"> Flow of 711 children in the clinical research database through selection of 503 operative records in 465 children, exclusions after review of the anchor operation, availability of each preoperative index test, and reduction of 793 eligible preoperative reports to 723 index examination episodes. All 52 children who received none of the three index examinations had other preoperative imaging (documented before transfer in four); the breakdown is shown at right.</w:t>
       </w:r>
     </w:p>
     <w:p>

</xml_diff>

<commit_message>
Final pre-submission fixes to the submission package
Code spans render in monospace instead of showing backticks. Tables are cited in
order in the Methods. Supplement 2 no longer refers to a non-existent S2.10.
Supplementary tables are renumbered S1-S19 in the order they appear, and the
subtitles of Supplements 3 and 4 name the paper. The Discussion calls the
published figures sensitivities. Supplement 3 no longer states untested
explanations for CT detection. Figure 1 and Figure 3A labels are corrected.
The cover letter is dated October 10, 2026 and the operations sheet matches the
manuscript.

Main text 2,978 words; number check 355 rows, 0 inconsistent; JACR checks pass.

Co-Authored-By: Claude Sonnet 5.5 <noreply@anthropic.com>
Claude-Session: https://claude.ai/code/session_013TkounLTBFVQRstE3VnhkM
</commit_message>
<xml_diff>
--- a/JACR_3_Manuscript_masked.docx
+++ b/JACR_3_Manuscript_masked.docx
@@ -24,7 +24,7 @@
         <w:spacing w:after="160" w:line="480" w:lineRule="auto"/>
       </w:pPr>
       <w:r>
-        <w:t>Word count: 2,976 (Introduction through Take-Home Points; excluding abstract, references, tables and figure legends); Tables: 4; Figures: 3; Supplemental material: Supplements 1–4</w:t>
+        <w:t>Word count: 2,978 (Introduction through Take-Home Points; excluding abstract, references, tables and figure legends); Tables: 4; Figures: 3; Supplemental material: Supplements 1–4</w:t>
       </w:r>
     </w:p>
     <w:p>
@@ -223,7 +223,7 @@
         <w:spacing w:after="160" w:line="480" w:lineRule="auto"/>
       </w:pPr>
       <w:r>
-        <w:t>Each ultrasound index examination was coded by two readers, an ultrasound physician and a pediatric surgeon, both authors who had reported none of the examinations, working independently from the findings and conclusion text against written criteria for twelve elements, from D3 and the duodenojejunal junction to the whirlpool sign and limiting bowel gas (Table 3). Technique elements were counted as documented whether the finding was normal or abnormal; the whirlpool sign, a finding, only where described as present. Agreement was assessed with Cohen kappa and disagreements adjudicated. Booking category and bedside performance were taken from the examination name; CT and UGI landmarks were coded by text patterns (Supplement 1).</w:t>
+        <w:t>Each ultrasound index examination was coded by two readers, an ultrasound physician and a pediatric surgeon, both authors who had reported none of the examinations, working independently from the findings and conclusion text against written criteria for twelve elements, from D3 and the duodenojejunal junction to the whirlpool sign and limiting bowel gas. Technique elements were counted as documented whether the finding was normal or abnormal; the whirlpool sign, a finding, only where described as present. Agreement was assessed with Cohen kappa and disagreements adjudicated. Booking category and bedside performance were taken from the examination name; CT and UGI landmarks were coded by text patterns (Supplement 1).</w:t>
       </w:r>
     </w:p>
     <w:p>
@@ -255,7 +255,7 @@
         <w:spacing w:after="160" w:line="480" w:lineRule="auto"/>
       </w:pPr>
       <w:r>
-        <w:t>Detection rates are presented with denominators and Wilson 95% confidence intervals (CIs). Between-modality comparison used a generalized estimating equation (GEE) logistic model [25] with an exchangeable working correlation, patient-level clustering and cluster-robust standard errors, unadjusted and adjusted for era (2012–2018 vs 2019–2026) and age group (≤28 days, 29 days–1 year, &gt;1 year), with standardized detection and cluster-bootstrap CIs. Modalities a child did not undergo are unobserved outcomes, not missing at random here, so these coefficients describe reporting among children who underwent each test. A pre-specified modality-by-volvulus interaction was not estimable, no ultrasound examination being positive among the five children without volvulus; a Firth penalized estimate is given in Supplement 2 [26, 27]. In the subgroup that underwent all three modalities, detection was compared using the Cochran Q test, the exact McNemar test and paired differences with bootstrap CIs (Supplement 2). The temporal change was explored, after inspection of the data, using modality-specific logistic models of detection on era before and after adding one covariate (booking category or contrast enhancement), reported as odds ratios and average marginal effects (Table 4); the era boundary was varied from 2019 to 2022 and era-by-covariate interactions fitted. Sensitivity analyses varied the outcome definition, index examination, interval to operation and ultrasound denominator (Supplement 2). P values were not adjusted for multiplicity; Supplement 2 lists which analyses were pre-specified. Analyses used Python 3.11 (statsmodels 0.15, SciPy 1.17).</w:t>
+        <w:t>Detection rates are presented with denominators and Wilson 95% confidence intervals (CIs). Between-modality comparison used a generalized estimating equation (GEE) logistic model [25] with an exchangeable working correlation, patient-level clustering and cluster-robust standard errors, unadjusted and adjusted for era (2012–2018 vs 2019–2026) and age group (≤28 days, 29 days–1 year, &gt;1 year), with standardized detection and cluster-bootstrap CIs. Modalities a child did not undergo are unobserved outcomes, not missing at random here, so these coefficients describe reporting among children who underwent each test. A pre-specified modality-by-volvulus interaction was not estimable, no ultrasound examination being positive among the five children without volvulus; a Firth penalized estimate is given in Supplement 2 [26, 27]. In the subgroup that underwent all three modalities, detection was compared using the Cochran Q test, the exact McNemar test and paired differences with bootstrap CIs (Supplement 2). The temporal change was explored, after inspection of the data, using modality-specific logistic models of detection on era before and after adding one covariate (booking category or contrast enhancement), reported as odds ratios and average marginal effects; the era boundary was varied from 2019 to 2022 and era-by-covariate interactions fitted. Sensitivity analyses varied the outcome definition, index examination, interval to operation and ultrasound denominator (Supplement 2). P values were not adjusted for multiplicity; Supplement 2 lists which analyses were pre-specified. Analyses used Python 3.11 (statsmodels 0.15, SciPy 1.17).</w:t>
       </w:r>
     </w:p>
     <w:p>
@@ -400,7 +400,7 @@
         <w:spacing w:after="160" w:line="480" w:lineRule="auto"/>
       </w:pPr>
       <w:r>
-        <w:t>Malrotation or volvulus was named in 54.7% of the surgically confirmed children who underwent ultrasound. The 2025 multicenter series, which excluded non-diagnostic and equivocal examinations, reported 93–97% for malrotation and 97% for volvulus [13], and a meta-analysis pooled 94% [11], both in children investigated for suspicion. In a multi-institutional cohort, 25.7% of examinations for malrotation were non-diagnostic on the original report [28]. These figures are not interchangeable: ours is conditioned on confirmed disease and on the indications that selected these children, theirs on those exclusions, so the difference combines case mix, examination quality and technique in proportions this audit cannot separate. What the audit does show is that the elements to which published performance is attributed were almost never documented here: D3 [16, 17], the most accurate sign for malrotation in the 2025 series [13]; the duodenojejunal junction [12, 15]; and enteric fluid, which was associated with better performance in the meta-analysis [11].</w:t>
+        <w:t>Malrotation or volvulus was named in 54.7% of the surgically confirmed children who underwent ultrasound. The 2025 multicenter series, which excluded non-diagnostic and equivocal examinations, reported sensitivities of 93–97% for malrotation and 97% for volvulus [13], and a meta-analysis found a pooled sensitivity of 94% [11], both in children investigated for suspicion. In a multi-institutional cohort, 25.7% of examinations for malrotation were non-diagnostic on the original report [28]. These figures are not interchangeable: ours is conditioned on confirmed disease and on the indications that selected these children, theirs on those exclusions, so the difference combines case mix, examination quality and technique in proportions this audit cannot separate. What the audit does show is that the elements to which published performance is attributed were almost never documented here: D3 [16, 17], the most accurate sign for malrotation in the 2025 series [13]; the duodenojejunal junction [12, 15]; and enteric fluid, which was associated with better performance in the meta-analysis [11].</w:t>
       </w:r>
     </w:p>
     <w:p>
@@ -510,7 +510,16 @@
         <w:t>Supplement 1.</w:t>
       </w:r>
       <w:r>
-        <w:t xml:space="preserve"> Text-classification algorithm and report-content audit, including the review of the reference standard and examination timing and the agreement of the two ultrasound readers: full rule dictionary, negation and scope handling, priority rules, worked examples of misclassification, the per-modality distribution of positive, negative and tentative labels, and a runnable reference implementation of the rule set (`Supplement_1_classifier.py`), which reproduces 99.0% of the final labels. That figure measures agreement between the published code and the labels used here; the 92% above measures agreement between the algorithm and the blinded adjudicator.</w:t>
+        <w:t xml:space="preserve"> Text-classification algorithm and report-content audit, including the review of the reference standard and examination timing and the agreement of the two ultrasound readers: full rule dictionary, negation and scope handling, priority rules, worked examples of misclassification, the per-modality distribution of positive, negative and tentative labels, and a runnable reference implementation of the rule set (</w:t>
+      </w:r>
+      <w:r>
+        <w:rPr>
+          <w:rFonts w:ascii="Courier New" w:hAnsi="Courier New"/>
+        </w:rPr>
+        <w:t>Supplement_1_classifier.py</w:t>
+      </w:r>
+      <w:r>
+        <w:t>), which reproduces 99.0% of the final labels. That figure measures agreement between the published code and the labels used here; the 92% above measures agreement between the algorithm and the blinded adjudicator.</w:t>
       </w:r>
     </w:p>
     <w:p>
@@ -3744,7 +3753,7 @@
           <w:i/>
           <w:sz w:val="17"/>
         </w:rPr>
-        <w:t>Groups overlap, because a child could receive more than one index test; columns therefore do not sum to the cohort total. Age at operation was calculated as age at admission for the operative encounter plus the interval from admission to operation. Presenting features were extracted from admission records by text search and are documentation rates, not verified prevalences. Symptom duration is the longest duration of a gastrointestinal symptom stated in the chief complaint of the operative admission; a child whose chief complaint stated none was counted as not having symptoms for 1 month or longer. The rightmost column shows the 52 children who received none of the three index tests; all of them nonetheless had other preoperative imaging (Figure 1). IQR interquartile range, UGI upper gastrointestinal.</w:t>
+        <w:t>Groups overlap, because a child could receive more than one index test; columns therefore do not sum to the cohort total. Age at operation was calculated as age at admission for the operative encounter plus the interval from admission to operation. Presenting features were extracted from admission records by text search and are documentation rates, not verified prevalences. Symptom duration is the longest duration of a gastrointestinal symptom stated in the chief complaint of the operative admission; a child whose chief complaint stated none was counted as not having symptoms for 1 month or longer. The rightmost column shows the 52 children who received none of the three index tests; all of them nonetheless had other preoperative imaging (Figure 1). IQR, interquartile range; UGI, upper gastrointestinal.</w:t>
       </w:r>
     </w:p>
     <w:p>
@@ -8524,7 +8533,7 @@
       <w:r>
         <w:drawing>
           <wp:inline xmlns:a="http://schemas.openxmlformats.org/drawingml/2006/main" xmlns:pic="http://schemas.openxmlformats.org/drawingml/2006/picture">
-            <wp:extent cx="5943600" cy="2267970"/>
+            <wp:extent cx="5943600" cy="2271415"/>
             <wp:docPr id="3" name="Picture 3"/>
             <wp:cNvGraphicFramePr>
               <a:graphicFrameLocks noChangeAspect="1"/>
@@ -8545,7 +8554,7 @@
                   <pic:spPr>
                     <a:xfrm>
                       <a:off x="0" y="0"/>
-                      <a:ext cx="5943600" cy="2267970"/>
+                      <a:ext cx="5943600" cy="2271415"/>
                     </a:xfrm>
                     <a:prstGeom prst="rect"/>
                   </pic:spPr>

</xml_diff>

<commit_message>
Three wording fixes from the second pre-submission read
The abstract says excluding "possible" wording, matching Table 2. Supplement 1
no longer calls gastric volvulus benign. The Discussion says elements rather than
duodenal anatomy, since enteric fluid is listed too.

Main text 2,977 words; number check 355 rows, 0 inconsistent.

Co-Authored-By: Claude Sonnet 5.5 <noreply@anthropic.com>
Claude-Session: https://claude.ai/code/session_013TkounLTBFVQRstE3VnhkM
</commit_message>
<xml_diff>
--- a/JACR_3_Manuscript_masked.docx
+++ b/JACR_3_Manuscript_masked.docx
@@ -24,7 +24,7 @@
         <w:spacing w:after="160" w:line="480" w:lineRule="auto"/>
       </w:pPr>
       <w:r>
-        <w:t>Word count: 2,978 (Introduction through Take-Home Points; excluding abstract, references, tables and figure legends); Tables: 4; Figures: 3; Supplemental material: Supplements 1–4</w:t>
+        <w:t>Word count: 2,977 (Introduction through Take-Home Points; excluding abstract, references, tables and figure legends); Tables: 4; Figures: 3; Supplemental material: Supplements 1–4</w:t>
       </w:r>
     </w:p>
     <w:p>
@@ -74,7 +74,7 @@
         <w:t>Results:</w:t>
       </w:r>
       <w:r>
-        <w:t xml:space="preserve"> Among 450 children (volvulus in 88.2%), 398 underwent at least one index test. Three of 117 ultrasound examinations (2.6%, 95% CI 0.9–7.3) documented the third portion of the duodenum or the duodenojejunal junction, 3 (2.6%) the mesenteric artery–vein relationship and 2 (1.7%) enteric fluid; a whirlpool sign was reported in 50.4%. Ultrasound named malrotation or volvulus in 64 of 117 examinations (54.7%, 45.7–63.4): in all 59 recording a whirlpool, a positivity criterion, and in 5 of 58 without one. A whirlpool was recorded in 59 of the 112 ultrasound-examined children with operatively confirmed volvulus. Detection was 53.8% counting only conclusions naming malrotation, 25.6% excluding tentative wording.</w:t>
+        <w:t xml:space="preserve"> Among 450 children (volvulus in 88.2%), 398 underwent at least one index test. Three of 117 ultrasound examinations (2.6%, 95% CI 0.9–7.3) documented the third portion of the duodenum or the duodenojejunal junction, 3 (2.6%) the mesenteric artery–vein relationship and 2 (1.7%) enteric fluid; a whirlpool sign was reported in 50.4%. Ultrasound named malrotation or volvulus in 64 of 117 examinations (54.7%, 45.7–63.4): in all 59 recording a whirlpool, a positivity criterion, and in 5 of 58 without one. A whirlpool was recorded in 59 of the 112 ultrasound-examined children with operatively confirmed volvulus. Detection was 53.8% counting only conclusions naming malrotation, 25.6% excluding "possible" wording.</w:t>
       </w:r>
     </w:p>
     <w:p>
@@ -392,7 +392,7 @@
         <w:spacing w:after="160" w:line="480" w:lineRule="auto"/>
       </w:pPr>
       <w:r>
-        <w:t>Over 13.6 years, routine ultrasound reports for children with surgically confirmed intestinal malrotation rarely recorded the duodenal anatomy to which contemporary ultrasound accuracy is attributed: D3 or the duodenojejunal junction in three of 117 examinations, enteric fluid in two. What they did record was the whirlpool sign, present in about half of all examinations and of the children with operatively confirmed volvulus. Such low documentation might be expected with free-text reports and no structured template, as here. Positive reports almost always described a whirlpool (59 of 64).</w:t>
+        <w:t>Over 13.6 years, routine ultrasound reports for children with surgically confirmed intestinal malrotation rarely recorded the elements to which contemporary ultrasound accuracy is attributed: D3 or the duodenojejunal junction in three of 117 examinations, enteric fluid in two. What they did record was the whirlpool sign, present in about half of all examinations and of the children with operatively confirmed volvulus. Such low documentation might be expected with free-text reports and no structured template, as here. Positive reports almost always described a whirlpool (59 of 64).</w:t>
       </w:r>
     </w:p>
     <w:p>

</xml_diff>